<commit_message>
Reconhece CNDs novas, cria abas Trabalhista/FGTS e soma guias SIEF no resumo
- Classificador passa a reconhecer: CND unificada SEFAZ+PGE-SP, certidão
  negativa de débitos mobiliários (Fiorilli), CRF do FGTS e CNDT (TST).
- Novas seções "Âmbito Trabalhista" e "FGTS" no memorando, só quando o PDF
  foi enviado (placeholder {{CERTIDOES_EXTRAS}} nos dois modelos).
- Resumo soma as guias em aberto do SIEF fora de parcelamento; com simulação
  de parcelamento (Simplificado ou Simples) entra só a 1ª parcela.

Co-Authored-By: Claude Opus 5.5 <noreply@anthropic.com>
</commit_message>
<xml_diff>
--- a/MODELO_MEMORANDO_n8n.docx
+++ b/MODELO_MEMORANDO_n8n.docx
@@ -254,6 +254,11 @@
           <w:szCs w:val="24"/>
         </w:rPr>
       </w:pPr>
+    </w:p>
+    <w:p>
+      <w:r>
+        <w:t>{{CERTIDOES_EXTRAS}}</w:t>
+      </w:r>
     </w:p>
     <w:p>
       <w:pPr>

</xml_diff>